<commit_message>
Rebuild resume: bullet-point format, quantified achievements, ATS-optimized
</commit_message>
<xml_diff>
--- a/resume.docx
+++ b/resume.docx
@@ -4,93 +4,996 @@
   <w:body>
     <w:p>
       <w:pPr>
-        <w:spacing w:after="20" w:before="0" w:line="276" w:lineRule="auto"/>
+        <w:spacing w:after="40" w:before="0" w:line="259" w:lineRule="auto"/>
+        <w:jc w:val="center"/>
       </w:pPr>
       <w:r>
         <w:rPr>
           <w:rFonts w:ascii="Calibri" w:hAnsi="Calibri"/>
           <w:b/>
-          <w:sz w:val="44"/>
+          <w:i w:val="0"/>
+          <w:color w:val="1A1A2E"/>
+          <w:sz w:val="36"/>
         </w:rPr>
-        <w:t>Matthew Villarreal</w:t>
+        <w:t>MATTHEW VILLARREAL</w:t>
       </w:r>
     </w:p>
     <w:p>
       <w:pPr>
-        <w:spacing w:after="40" w:before="0" w:line="276" w:lineRule="auto"/>
+        <w:spacing w:after="120" w:before="0"/>
+        <w:jc w:val="center"/>
       </w:pPr>
       <w:r>
         <w:rPr>
           <w:rFonts w:ascii="Calibri" w:hAnsi="Calibri"/>
           <w:b w:val="0"/>
-          <w:sz w:val="20"/>
+          <w:i w:val="0"/>
+          <w:color w:val="555555"/>
+          <w:sz w:val="19"/>
         </w:rPr>
-        <w:t>Moorpark, CA | (832) 248-4887 | matthew.d.villarreal@gmail.com | linkedin.com/in/matthewvillarreal</w:t>
+        <w:t xml:space="preserve">Moorpark, CA  |  (832) 248-4887  |  matthew.d.villarreal@gmail.com  |  </w:t>
+      </w:r>
+      <w:r>
+        <w:rPr>
+          <w:rFonts w:ascii="Calibri" w:hAnsi="Calibri"/>
+          <w:b w:val="0"/>
+          <w:i w:val="0"/>
+          <w:color w:val="1A5C6E"/>
+          <w:sz w:val="19"/>
+        </w:rPr>
+        <w:t>linkedin.com/in/matthewvillarreal</w:t>
       </w:r>
     </w:p>
     <w:p>
       <w:pPr>
-        <w:spacing w:after="120" w:before="0" w:line="276" w:lineRule="auto"/>
+        <w:spacing w:after="60" w:before="200" w:line="259" w:lineRule="auto"/>
+        <w:pBdr>
+          <w:bottom w:val="single" w:sz="4" w:space="2" w:color="999999"/>
+        </w:pBdr>
       </w:pPr>
       <w:r>
         <w:rPr>
           <w:rFonts w:ascii="Calibri" w:hAnsi="Calibri"/>
           <w:b/>
-          <w:sz w:val="28"/>
+          <w:i w:val="0"/>
+          <w:color w:val="1A1A2E"/>
+          <w:sz w:val="21"/>
         </w:rPr>
-        <w:t>Senior Proposals Specialist</w:t>
+        <w:t>PROFESSIONAL SUMMARY</w:t>
       </w:r>
     </w:p>
     <w:p>
       <w:pPr>
-        <w:spacing w:after="80" w:before="0" w:line="276" w:lineRule="auto"/>
+        <w:spacing w:after="40" w:before="0" w:line="259" w:lineRule="auto"/>
+      </w:pPr>
+      <w:r>
+        <w:rPr>
+          <w:rFonts w:ascii="Calibri" w:hAnsi="Calibri"/>
+          <w:b w:val="0"/>
+          <w:i w:val="0"/>
+          <w:sz w:val="20"/>
+        </w:rPr>
+        <w:t>Senior Proposals Specialist with 10+ years across proposal management, commercial operations, engineering, and project management. Led past performance and adverse performance narratives on 10+ government pursuits representing $2.9B+ in aggregate contract value. Proven ability to synthesize complex compliance requirements into winning proposals under compressed deadlines.</w:t>
+      </w:r>
+    </w:p>
+    <w:p>
+      <w:pPr>
+        <w:spacing w:after="60" w:before="200" w:line="259" w:lineRule="auto"/>
+        <w:pBdr>
+          <w:bottom w:val="single" w:sz="4" w:space="2" w:color="999999"/>
+        </w:pBdr>
       </w:pPr>
       <w:r>
         <w:rPr>
           <w:rFonts w:ascii="Calibri" w:hAnsi="Calibri"/>
           <w:b/>
-          <w:sz w:val="20"/>
+          <w:i w:val="0"/>
+          <w:color w:val="1A1A2E"/>
+          <w:sz w:val="21"/>
         </w:rPr>
-        <w:t xml:space="preserve">Overview: </w:t>
+        <w:t>PROFESSIONAL EXPERIENCE</w:t>
+      </w:r>
+    </w:p>
+    <w:p>
+      <w:pPr>
+        <w:spacing w:after="20" w:before="160" w:line="259" w:lineRule="auto"/>
+      </w:pPr>
+      <w:r>
+        <w:rPr>
+          <w:rFonts w:ascii="Calibri" w:hAnsi="Calibri"/>
+          <w:b/>
+          <w:i w:val="0"/>
+          <w:color w:val="1A1A2E"/>
+          <w:sz w:val="21"/>
+        </w:rPr>
+        <w:t>KBR, Inc.</w:t>
       </w:r>
       <w:r>
         <w:rPr>
           <w:rFonts w:ascii="Calibri" w:hAnsi="Calibri"/>
           <w:b w:val="0"/>
-          <w:sz w:val="20"/>
+          <w:i w:val="0"/>
+          <w:color w:val="555555"/>
+          <w:sz w:val="19"/>
         </w:rPr>
-        <w:t>I am an organized and objective-driven professional with over 10 years of proposal management, commercial operations, project management, and engineering experience. I bring specialized past performance and adverse performance analysis expertise, universal best-practice project management knowledge, and a proven ability to coordinate complex proposals across geographically distributed teams.</w:t>
+        <w:t xml:space="preserve">  —  Moorpark, CA</w:t>
       </w:r>
     </w:p>
     <w:p>
       <w:pPr>
-        <w:spacing w:after="40" w:before="0" w:line="276" w:lineRule="auto"/>
+        <w:spacing w:after="40" w:before="0" w:line="259" w:lineRule="auto"/>
+      </w:pPr>
+      <w:r>
+        <w:rPr>
+          <w:rFonts w:ascii="Calibri" w:hAnsi="Calibri"/>
+          <w:b w:val="0"/>
+          <w:i/>
+          <w:color w:val="1A1A2E"/>
+          <w:sz w:val="20"/>
+        </w:rPr>
+        <w:t>Senior Proposals Specialist</w:t>
+      </w:r>
+      <w:r>
+        <w:rPr>
+          <w:rFonts w:ascii="Calibri" w:hAnsi="Calibri"/>
+          <w:b w:val="0"/>
+          <w:i w:val="0"/>
+          <w:color w:val="777777"/>
+          <w:sz w:val="19"/>
+        </w:rPr>
+        <w:t xml:space="preserve">  |  Mar 2022 – Present</w:t>
+      </w:r>
+    </w:p>
+    <w:p>
+      <w:pPr>
+        <w:spacing w:after="0" w:before="0" w:line="259" w:lineRule="auto"/>
+        <w:ind w:left="288" w:hanging="216"/>
+      </w:pPr>
+      <w:r>
+        <w:rPr>
+          <w:rFonts w:ascii="Calibri" w:hAnsi="Calibri"/>
+          <w:b w:val="0"/>
+          <w:i w:val="0"/>
+          <w:color w:val="1A5C6E"/>
+          <w:sz w:val="20"/>
+        </w:rPr>
+        <w:t xml:space="preserve">•  </w:t>
+      </w:r>
+      <w:r>
+        <w:rPr>
+          <w:rFonts w:ascii="Calibri" w:hAnsi="Calibri"/>
+          <w:b w:val="0"/>
+          <w:i w:val="0"/>
+          <w:sz w:val="20"/>
+        </w:rPr>
+        <w:t>Led past performance and adverse performance narrative development for 10+ government proposals representing $2.9B+ in aggregate contract value — managed compliance reviews, color-team support, and capture-phase contributions</w:t>
+      </w:r>
+    </w:p>
+    <w:p>
+      <w:pPr>
+        <w:spacing w:after="0" w:before="0" w:line="259" w:lineRule="auto"/>
+        <w:ind w:left="288" w:hanging="216"/>
+      </w:pPr>
+      <w:r>
+        <w:rPr>
+          <w:rFonts w:ascii="Calibri" w:hAnsi="Calibri"/>
+          <w:b w:val="0"/>
+          <w:i w:val="0"/>
+          <w:color w:val="1A5C6E"/>
+          <w:sz w:val="20"/>
+        </w:rPr>
+        <w:t xml:space="preserve">•  </w:t>
+      </w:r>
+      <w:r>
+        <w:rPr>
+          <w:rFonts w:ascii="Calibri" w:hAnsi="Calibri"/>
+          <w:b w:val="0"/>
+          <w:i w:val="0"/>
+          <w:sz w:val="20"/>
+        </w:rPr>
+        <w:t>Directed adverse past performance collection, analysis, and narrative development across multiple predecessor contracts spanning CONUS and OCONUS sites — synthesized letters of concern, corrective action reports, Cure Notices, and CPARs into compliant, evaluator-safe recovery narratives under compressed page-count constraints</w:t>
+      </w:r>
+    </w:p>
+    <w:p>
+      <w:pPr>
+        <w:spacing w:after="0" w:before="0" w:line="259" w:lineRule="auto"/>
+        <w:ind w:left="288" w:hanging="216"/>
+      </w:pPr>
+      <w:r>
+        <w:rPr>
+          <w:rFonts w:ascii="Calibri" w:hAnsi="Calibri"/>
+          <w:b w:val="0"/>
+          <w:i w:val="0"/>
+          <w:color w:val="1A5C6E"/>
+          <w:sz w:val="20"/>
+        </w:rPr>
+        <w:t xml:space="preserve">•  </w:t>
+      </w:r>
+      <w:r>
+        <w:rPr>
+          <w:rFonts w:ascii="Calibri" w:hAnsi="Calibri"/>
+          <w:b w:val="0"/>
+          <w:i w:val="0"/>
+          <w:sz w:val="20"/>
+        </w:rPr>
+        <w:t>Served as Past Performance Lead on major contested re-competes, coordinating data calls across geographically distributed program teams and navigating complex multi-volume compliance requirements</w:t>
+      </w:r>
+    </w:p>
+    <w:p>
+      <w:pPr>
+        <w:spacing w:after="0" w:before="0" w:line="259" w:lineRule="auto"/>
+        <w:ind w:left="288" w:hanging="216"/>
+      </w:pPr>
+      <w:r>
+        <w:rPr>
+          <w:rFonts w:ascii="Calibri" w:hAnsi="Calibri"/>
+          <w:b w:val="0"/>
+          <w:i w:val="0"/>
+          <w:color w:val="1A5C6E"/>
+          <w:sz w:val="20"/>
+        </w:rPr>
+        <w:t xml:space="preserve">•  </w:t>
+      </w:r>
+      <w:r>
+        <w:rPr>
+          <w:rFonts w:ascii="Calibri" w:hAnsi="Calibri"/>
+          <w:b w:val="0"/>
+          <w:i w:val="0"/>
+          <w:sz w:val="20"/>
+        </w:rPr>
+        <w:t>Contributed to RFI development, contract strengths analysis, and glide-path solutioning for early-phase captures, including a $600M+ commercial services pursuit</w:t>
+      </w:r>
+    </w:p>
+    <w:p>
+      <w:pPr>
+        <w:spacing w:after="0" w:before="0" w:line="259" w:lineRule="auto"/>
+        <w:ind w:left="288" w:hanging="216"/>
+      </w:pPr>
+      <w:r>
+        <w:rPr>
+          <w:rFonts w:ascii="Calibri" w:hAnsi="Calibri"/>
+          <w:b w:val="0"/>
+          <w:i w:val="0"/>
+          <w:color w:val="1A5C6E"/>
+          <w:sz w:val="20"/>
+        </w:rPr>
+        <w:t xml:space="preserve">•  </w:t>
+      </w:r>
+      <w:r>
+        <w:rPr>
+          <w:rFonts w:ascii="Calibri" w:hAnsi="Calibri"/>
+          <w:b w:val="0"/>
+          <w:i w:val="0"/>
+          <w:sz w:val="20"/>
+        </w:rPr>
+        <w:t>Maintained cross-functional compliance trackers for multi-volume submissions; served as independent reviewer (IPR) for corporate experience sections across color-team milestone reviews</w:t>
+      </w:r>
+    </w:p>
+    <w:p>
+      <w:pPr>
+        <w:spacing w:after="20" w:before="160" w:line="259" w:lineRule="auto"/>
       </w:pPr>
       <w:r>
         <w:rPr>
           <w:rFonts w:ascii="Calibri" w:hAnsi="Calibri"/>
           <w:b/>
-          <w:sz w:val="20"/>
+          <w:i w:val="0"/>
+          <w:color w:val="1A1A2E"/>
+          <w:sz w:val="21"/>
         </w:rPr>
-        <w:t xml:space="preserve">Skills: </w:t>
+        <w:t>Brüel &amp; Kjær Vibro (B&amp;K Vibro)</w:t>
       </w:r>
       <w:r>
         <w:rPr>
           <w:rFonts w:ascii="Calibri" w:hAnsi="Calibri"/>
           <w:b w:val="0"/>
-          <w:sz w:val="20"/>
+          <w:i w:val="0"/>
+          <w:color w:val="555555"/>
+          <w:sz w:val="19"/>
         </w:rPr>
-        <w:t>Past Performance Analysis | Adverse Performance Narratives | Compliance Review | Proposal Management | Capture Support | Project Management | Operations Management | Process Improvement | Root-Cause Analysis | Project Planning | Business Development | Strategic Planning | Sales Forecasting | Event Coordination | Public Speaking | Team Building</w:t>
+        <w:t xml:space="preserve">  —  Houston, TX</w:t>
       </w:r>
     </w:p>
     <w:p>
       <w:pPr>
-        <w:spacing w:after="80" w:before="0" w:line="276" w:lineRule="auto"/>
+        <w:spacing w:after="40" w:before="0" w:line="259" w:lineRule="auto"/>
+      </w:pPr>
+      <w:r>
+        <w:rPr>
+          <w:rFonts w:ascii="Calibri" w:hAnsi="Calibri"/>
+          <w:b w:val="0"/>
+          <w:i/>
+          <w:color w:val="1A1A2E"/>
+          <w:sz w:val="20"/>
+        </w:rPr>
+        <w:t>Sales &amp; Operations Manager</w:t>
+      </w:r>
+      <w:r>
+        <w:rPr>
+          <w:rFonts w:ascii="Calibri" w:hAnsi="Calibri"/>
+          <w:b w:val="0"/>
+          <w:i w:val="0"/>
+          <w:color w:val="777777"/>
+          <w:sz w:val="19"/>
+        </w:rPr>
+        <w:t xml:space="preserve">  |  Aug 2018 – Feb 2022</w:t>
+      </w:r>
+    </w:p>
+    <w:p>
+      <w:pPr>
+        <w:spacing w:after="0" w:before="0" w:line="259" w:lineRule="auto"/>
+        <w:ind w:left="288" w:hanging="216"/>
+      </w:pPr>
+      <w:r>
+        <w:rPr>
+          <w:rFonts w:ascii="Calibri" w:hAnsi="Calibri"/>
+          <w:b w:val="0"/>
+          <w:i w:val="0"/>
+          <w:color w:val="1A5C6E"/>
+          <w:sz w:val="20"/>
+        </w:rPr>
+        <w:t xml:space="preserve">•  </w:t>
+      </w:r>
+      <w:r>
+        <w:rPr>
+          <w:rFonts w:ascii="Calibri" w:hAnsi="Calibri"/>
+          <w:b w:val="0"/>
+          <w:i w:val="0"/>
+          <w:sz w:val="20"/>
+        </w:rPr>
+        <w:t>Managed western US sales region across 17 states; served as Salesforce Administrator for a global team of 40+ across every continent — generated sales forecasting dashboards and reports for executive leadership</w:t>
+      </w:r>
+    </w:p>
+    <w:p>
+      <w:pPr>
+        <w:spacing w:after="0" w:before="0" w:line="259" w:lineRule="auto"/>
+        <w:ind w:left="288" w:hanging="216"/>
+      </w:pPr>
+      <w:r>
+        <w:rPr>
+          <w:rFonts w:ascii="Calibri" w:hAnsi="Calibri"/>
+          <w:b w:val="0"/>
+          <w:i w:val="0"/>
+          <w:color w:val="1A5C6E"/>
+          <w:sz w:val="20"/>
+        </w:rPr>
+        <w:t xml:space="preserve">•  </w:t>
+      </w:r>
+      <w:r>
+        <w:rPr>
+          <w:rFonts w:ascii="Calibri" w:hAnsi="Calibri"/>
+          <w:b w:val="0"/>
+          <w:i w:val="0"/>
+          <w:sz w:val="20"/>
+        </w:rPr>
+        <w:t>Project managed CRM migration from legacy system to Salesforce in 6 months — scoped requirements, managed data migration, and developed/delivered training to 75+ sales managers globally</w:t>
+      </w:r>
+    </w:p>
+    <w:p>
+      <w:pPr>
+        <w:spacing w:after="0" w:before="0" w:line="259" w:lineRule="auto"/>
+        <w:ind w:left="288" w:hanging="216"/>
+      </w:pPr>
+      <w:r>
+        <w:rPr>
+          <w:rFonts w:ascii="Calibri" w:hAnsi="Calibri"/>
+          <w:b w:val="0"/>
+          <w:i w:val="0"/>
+          <w:color w:val="1A5C6E"/>
+          <w:sz w:val="20"/>
+        </w:rPr>
+        <w:t xml:space="preserve">•  </w:t>
+      </w:r>
+      <w:r>
+        <w:rPr>
+          <w:rFonts w:ascii="Calibri" w:hAnsi="Calibri"/>
+          <w:b w:val="0"/>
+          <w:i w:val="0"/>
+          <w:sz w:val="20"/>
+        </w:rPr>
+        <w:t>Led a $4M multi-country proposal involving resources from Denmark, Germany, and Brazil, coordinating across C-suite stakeholders at B&amp;K Vibro</w:t>
+      </w:r>
+    </w:p>
+    <w:p>
+      <w:pPr>
+        <w:spacing w:after="0" w:before="0" w:line="259" w:lineRule="auto"/>
+        <w:ind w:left="288" w:hanging="216"/>
+      </w:pPr>
+      <w:r>
+        <w:rPr>
+          <w:rFonts w:ascii="Calibri" w:hAnsi="Calibri"/>
+          <w:b w:val="0"/>
+          <w:i w:val="0"/>
+          <w:color w:val="1A5C6E"/>
+          <w:sz w:val="20"/>
+        </w:rPr>
+        <w:t xml:space="preserve">•  </w:t>
+      </w:r>
+      <w:r>
+        <w:rPr>
+          <w:rFonts w:ascii="Calibri" w:hAnsi="Calibri"/>
+          <w:b w:val="0"/>
+          <w:i w:val="0"/>
+          <w:sz w:val="20"/>
+        </w:rPr>
+        <w:t>Developed FY2022 business planning resources for the Americas sales team with a $7M forecast; discovered and developed opportunities with $1M+ revenue potential</w:t>
+      </w:r>
+    </w:p>
+    <w:p>
+      <w:pPr>
+        <w:spacing w:after="0" w:before="0" w:line="259" w:lineRule="auto"/>
+        <w:ind w:left="288" w:hanging="216"/>
+      </w:pPr>
+      <w:r>
+        <w:rPr>
+          <w:rFonts w:ascii="Calibri" w:hAnsi="Calibri"/>
+          <w:b w:val="0"/>
+          <w:i w:val="0"/>
+          <w:color w:val="1A5C6E"/>
+          <w:sz w:val="20"/>
+        </w:rPr>
+        <w:t xml:space="preserve">•  </w:t>
+      </w:r>
+      <w:r>
+        <w:rPr>
+          <w:rFonts w:ascii="Calibri" w:hAnsi="Calibri"/>
+          <w:b w:val="0"/>
+          <w:i w:val="0"/>
+          <w:sz w:val="20"/>
+        </w:rPr>
+        <w:t>Managed all proposal development across the Americas with signature authority for budgetary proposals up to $500k</w:t>
+      </w:r>
+    </w:p>
+    <w:p>
+      <w:pPr>
+        <w:spacing w:after="20" w:before="160" w:line="259" w:lineRule="auto"/>
       </w:pPr>
       <w:r>
         <w:rPr>
           <w:rFonts w:ascii="Calibri" w:hAnsi="Calibri"/>
           <w:b/>
+          <w:i w:val="0"/>
+          <w:color w:val="1A1A2E"/>
+          <w:sz w:val="21"/>
+        </w:rPr>
+        <w:t>KBR, Inc.</w:t>
+      </w:r>
+      <w:r>
+        <w:rPr>
+          <w:rFonts w:ascii="Calibri" w:hAnsi="Calibri"/>
+          <w:b w:val="0"/>
+          <w:i w:val="0"/>
+          <w:color w:val="555555"/>
+          <w:sz w:val="19"/>
+        </w:rPr>
+        <w:t xml:space="preserve">  —  Houston, TX</w:t>
+      </w:r>
+    </w:p>
+    <w:p>
+      <w:pPr>
+        <w:spacing w:after="40" w:before="0" w:line="259" w:lineRule="auto"/>
+      </w:pPr>
+      <w:r>
+        <w:rPr>
+          <w:rFonts w:ascii="Calibri" w:hAnsi="Calibri"/>
+          <w:b w:val="0"/>
+          <w:i/>
+          <w:color w:val="1A1A2E"/>
+          <w:sz w:val="20"/>
+        </w:rPr>
+        <w:t>Proposal Specialist / Project Manager</w:t>
+      </w:r>
+      <w:r>
+        <w:rPr>
+          <w:rFonts w:ascii="Calibri" w:hAnsi="Calibri"/>
+          <w:b w:val="0"/>
+          <w:i w:val="0"/>
+          <w:color w:val="777777"/>
+          <w:sz w:val="19"/>
+        </w:rPr>
+        <w:t xml:space="preserve">  |  Jul 2016 – Jul 2018</w:t>
+      </w:r>
+    </w:p>
+    <w:p>
+      <w:pPr>
+        <w:spacing w:after="0" w:before="0" w:line="259" w:lineRule="auto"/>
+        <w:ind w:left="288" w:hanging="216"/>
+      </w:pPr>
+      <w:r>
+        <w:rPr>
+          <w:rFonts w:ascii="Calibri" w:hAnsi="Calibri"/>
+          <w:b w:val="0"/>
+          <w:i w:val="0"/>
+          <w:color w:val="1A5C6E"/>
+          <w:sz w:val="20"/>
+        </w:rPr>
+        <w:t xml:space="preserve">•  </w:t>
+      </w:r>
+      <w:r>
+        <w:rPr>
+          <w:rFonts w:ascii="Calibri" w:hAnsi="Calibri"/>
+          <w:b w:val="0"/>
+          <w:i w:val="0"/>
+          <w:sz w:val="20"/>
+        </w:rPr>
+        <w:t>Managed complex proposal development across multiple KBR business functions — supported sales, capture, and business development through technical solutioning, win theme development, and management review coordination</w:t>
+      </w:r>
+    </w:p>
+    <w:p>
+      <w:pPr>
+        <w:spacing w:after="0" w:before="0" w:line="259" w:lineRule="auto"/>
+        <w:ind w:left="288" w:hanging="216"/>
+      </w:pPr>
+      <w:r>
+        <w:rPr>
+          <w:rFonts w:ascii="Calibri" w:hAnsi="Calibri"/>
+          <w:b w:val="0"/>
+          <w:i w:val="0"/>
+          <w:color w:val="1A5C6E"/>
+          <w:sz w:val="20"/>
+        </w:rPr>
+        <w:t xml:space="preserve">•  </w:t>
+      </w:r>
+      <w:r>
+        <w:rPr>
+          <w:rFonts w:ascii="Calibri" w:hAnsi="Calibri"/>
+          <w:b w:val="0"/>
+          <w:i w:val="0"/>
+          <w:sz w:val="20"/>
+        </w:rPr>
+        <w:t>Designed Gantt-chart operations schedules for mobilizing and executing military-focused projects worldwide ranging from $1M to $10M</w:t>
+      </w:r>
+    </w:p>
+    <w:p>
+      <w:pPr>
+        <w:spacing w:after="0" w:before="0" w:line="259" w:lineRule="auto"/>
+        <w:ind w:left="288" w:hanging="216"/>
+      </w:pPr>
+      <w:r>
+        <w:rPr>
+          <w:rFonts w:ascii="Calibri" w:hAnsi="Calibri"/>
+          <w:b w:val="0"/>
+          <w:i w:val="0"/>
+          <w:color w:val="1A5C6E"/>
+          <w:sz w:val="20"/>
+        </w:rPr>
+        <w:t xml:space="preserve">•  </w:t>
+      </w:r>
+      <w:r>
+        <w:rPr>
+          <w:rFonts w:ascii="Calibri" w:hAnsi="Calibri"/>
+          <w:b w:val="0"/>
+          <w:i w:val="0"/>
+          <w:sz w:val="20"/>
+        </w:rPr>
+        <w:t>Researched and applied DoD, Army, Navy, and Air Force SOPs and quality standards to ensure compliance in 10+ individual submissions</w:t>
+      </w:r>
+    </w:p>
+    <w:p>
+      <w:pPr>
+        <w:spacing w:after="0" w:before="0" w:line="259" w:lineRule="auto"/>
+        <w:ind w:left="288" w:hanging="216"/>
+      </w:pPr>
+      <w:r>
+        <w:rPr>
+          <w:rFonts w:ascii="Calibri" w:hAnsi="Calibri"/>
+          <w:b w:val="0"/>
+          <w:i w:val="0"/>
+          <w:color w:val="1A5C6E"/>
+          <w:sz w:val="20"/>
+        </w:rPr>
+        <w:t xml:space="preserve">•  </w:t>
+      </w:r>
+      <w:r>
+        <w:rPr>
+          <w:rFonts w:ascii="Calibri" w:hAnsi="Calibri"/>
+          <w:b w:val="0"/>
+          <w:i w:val="0"/>
+          <w:sz w:val="20"/>
+        </w:rPr>
+        <w:t>Analyzed asset management and supply chain data, resulting in prioritized improvements that optimized KBR's global program</w:t>
+      </w:r>
+    </w:p>
+    <w:p>
+      <w:pPr>
+        <w:spacing w:after="20" w:before="160" w:line="259" w:lineRule="auto"/>
+      </w:pPr>
+      <w:r>
+        <w:rPr>
+          <w:rFonts w:ascii="Calibri" w:hAnsi="Calibri"/>
+          <w:b/>
+          <w:i w:val="0"/>
+          <w:color w:val="1A1A2E"/>
+          <w:sz w:val="21"/>
+        </w:rPr>
+        <w:t>KBR, Inc.</w:t>
+      </w:r>
+      <w:r>
+        <w:rPr>
+          <w:rFonts w:ascii="Calibri" w:hAnsi="Calibri"/>
+          <w:b w:val="0"/>
+          <w:i w:val="0"/>
+          <w:color w:val="555555"/>
+          <w:sz w:val="19"/>
+        </w:rPr>
+        <w:t xml:space="preserve">  —  Houston, TX</w:t>
+      </w:r>
+    </w:p>
+    <w:p>
+      <w:pPr>
+        <w:spacing w:after="40" w:before="0" w:line="259" w:lineRule="auto"/>
+      </w:pPr>
+      <w:r>
+        <w:rPr>
+          <w:rFonts w:ascii="Calibri" w:hAnsi="Calibri"/>
+          <w:b w:val="0"/>
+          <w:i/>
+          <w:color w:val="1A1A2E"/>
+          <w:sz w:val="20"/>
+        </w:rPr>
+        <w:t>Mechanical Engineer / Project Manager</w:t>
+      </w:r>
+      <w:r>
+        <w:rPr>
+          <w:rFonts w:ascii="Calibri" w:hAnsi="Calibri"/>
+          <w:b w:val="0"/>
+          <w:i w:val="0"/>
+          <w:color w:val="777777"/>
+          <w:sz w:val="19"/>
+        </w:rPr>
+        <w:t xml:space="preserve">  |  Mar 2013 – Jul 2016</w:t>
+      </w:r>
+    </w:p>
+    <w:p>
+      <w:pPr>
+        <w:spacing w:after="0" w:before="0" w:line="259" w:lineRule="auto"/>
+        <w:ind w:left="288" w:hanging="216"/>
+      </w:pPr>
+      <w:r>
+        <w:rPr>
+          <w:rFonts w:ascii="Calibri" w:hAnsi="Calibri"/>
+          <w:b w:val="0"/>
+          <w:i w:val="0"/>
+          <w:color w:val="1A5C6E"/>
+          <w:sz w:val="20"/>
+        </w:rPr>
+        <w:t xml:space="preserve">•  </w:t>
+      </w:r>
+      <w:r>
+        <w:rPr>
+          <w:rFonts w:ascii="Calibri" w:hAnsi="Calibri"/>
+          <w:b w:val="0"/>
+          <w:i w:val="0"/>
+          <w:sz w:val="20"/>
+        </w:rPr>
+        <w:t>Led technical bid analysis, incorporating corporate and industry standards while facilitating bid conditioning meetings with equipment vendors</w:t>
+      </w:r>
+    </w:p>
+    <w:p>
+      <w:pPr>
+        <w:spacing w:after="0" w:before="0" w:line="259" w:lineRule="auto"/>
+        <w:ind w:left="288" w:hanging="216"/>
+      </w:pPr>
+      <w:r>
+        <w:rPr>
+          <w:rFonts w:ascii="Calibri" w:hAnsi="Calibri"/>
+          <w:b w:val="0"/>
+          <w:i w:val="0"/>
+          <w:color w:val="1A5C6E"/>
+          <w:sz w:val="20"/>
+        </w:rPr>
+        <w:t xml:space="preserve">•  </w:t>
+      </w:r>
+      <w:r>
+        <w:rPr>
+          <w:rFonts w:ascii="Calibri" w:hAnsi="Calibri"/>
+          <w:b w:val="0"/>
+          <w:i w:val="0"/>
+          <w:sz w:val="20"/>
+        </w:rPr>
+        <w:t>Project managed an $850M plant expansion — led daily stand-up meetings, managed scheduling and milestone tracking, and coordinated across engineering disciplines</w:t>
+      </w:r>
+    </w:p>
+    <w:p>
+      <w:pPr>
+        <w:spacing w:after="0" w:before="0" w:line="259" w:lineRule="auto"/>
+        <w:ind w:left="288" w:hanging="216"/>
+      </w:pPr>
+      <w:r>
+        <w:rPr>
+          <w:rFonts w:ascii="Calibri" w:hAnsi="Calibri"/>
+          <w:b w:val="0"/>
+          <w:i w:val="0"/>
+          <w:color w:val="1A5C6E"/>
+          <w:sz w:val="20"/>
+        </w:rPr>
+        <w:t xml:space="preserve">•  </w:t>
+      </w:r>
+      <w:r>
+        <w:rPr>
+          <w:rFonts w:ascii="Calibri" w:hAnsi="Calibri"/>
+          <w:b w:val="0"/>
+          <w:i w:val="0"/>
+          <w:sz w:val="20"/>
+        </w:rPr>
+        <w:t>Managed a team of 10 millwrights and electricians to commission and repair complex equipment at an ammonia plant near New Orleans, LA</w:t>
+      </w:r>
+    </w:p>
+    <w:p>
+      <w:pPr>
+        <w:spacing w:after="0" w:before="0" w:line="259" w:lineRule="auto"/>
+        <w:ind w:left="288" w:hanging="216"/>
+      </w:pPr>
+      <w:r>
+        <w:rPr>
+          <w:rFonts w:ascii="Calibri" w:hAnsi="Calibri"/>
+          <w:b w:val="0"/>
+          <w:i w:val="0"/>
+          <w:color w:val="1A5C6E"/>
+          <w:sz w:val="20"/>
+        </w:rPr>
+        <w:t xml:space="preserve">•  </w:t>
+      </w:r>
+      <w:r>
+        <w:rPr>
+          <w:rFonts w:ascii="Calibri" w:hAnsi="Calibri"/>
+          <w:b w:val="0"/>
+          <w:i w:val="0"/>
+          <w:sz w:val="20"/>
+        </w:rPr>
+        <w:t>Performed root-cause failure analysis on complex bearing seal failure — gathered data, connected vendors with senior leadership, and implemented countermeasures within weeks</w:t>
+      </w:r>
+    </w:p>
+    <w:p>
+      <w:pPr>
+        <w:spacing w:after="0" w:before="0" w:line="259" w:lineRule="auto"/>
+        <w:ind w:left="288" w:hanging="216"/>
+      </w:pPr>
+      <w:r>
+        <w:rPr>
+          <w:rFonts w:ascii="Calibri" w:hAnsi="Calibri"/>
+          <w:b w:val="0"/>
+          <w:i w:val="0"/>
+          <w:color w:val="1A5C6E"/>
+          <w:sz w:val="20"/>
+        </w:rPr>
+        <w:t xml:space="preserve">•  </w:t>
+      </w:r>
+      <w:r>
+        <w:rPr>
+          <w:rFonts w:ascii="Calibri" w:hAnsi="Calibri"/>
+          <w:b w:val="0"/>
+          <w:i w:val="0"/>
+          <w:sz w:val="20"/>
+        </w:rPr>
+        <w:t>Evaluated 50+ detailed technical documents to develop formal bid analyses for review by Principal Engineers; updated KBR's cooling tower technical standards to comply with new US government regulations</w:t>
+      </w:r>
+    </w:p>
+    <w:p>
+      <w:pPr>
+        <w:spacing w:after="20" w:before="160" w:line="259" w:lineRule="auto"/>
+      </w:pPr>
+      <w:r>
+        <w:rPr>
+          <w:rFonts w:ascii="Calibri" w:hAnsi="Calibri"/>
+          <w:b/>
+          <w:i w:val="0"/>
+          <w:color w:val="1A1A2E"/>
+          <w:sz w:val="21"/>
+        </w:rPr>
+        <w:t>B&amp;K Vibro, Metrix Instrument Co., Texas A&amp;M — Texas</w:t>
+      </w:r>
+      <w:r>
+        <w:rPr>
+          <w:rFonts w:ascii="Calibri" w:hAnsi="Calibri"/>
+          <w:b w:val="0"/>
+          <w:i w:val="0"/>
+          <w:color w:val="555555"/>
+          <w:sz w:val="19"/>
+        </w:rPr>
+        <w:t xml:space="preserve">  —  </w:t>
+      </w:r>
+    </w:p>
+    <w:p>
+      <w:pPr>
+        <w:spacing w:after="40" w:before="0" w:line="259" w:lineRule="auto"/>
+      </w:pPr>
+      <w:r>
+        <w:rPr>
+          <w:rFonts w:ascii="Calibri" w:hAnsi="Calibri"/>
+          <w:b w:val="0"/>
+          <w:i/>
+          <w:color w:val="1A1A2E"/>
+          <w:sz w:val="20"/>
+        </w:rPr>
+        <w:t>Sales Engineer / Inside Technical Sales / IT Support / CAD-CAM Programmer</w:t>
+      </w:r>
+      <w:r>
+        <w:rPr>
+          <w:rFonts w:ascii="Calibri" w:hAnsi="Calibri"/>
+          <w:b w:val="0"/>
+          <w:i w:val="0"/>
+          <w:color w:val="777777"/>
+          <w:sz w:val="19"/>
+        </w:rPr>
+        <w:t xml:space="preserve">  |  2005 – 2012</w:t>
+      </w:r>
+    </w:p>
+    <w:p>
+      <w:pPr>
+        <w:spacing w:after="0" w:before="0" w:line="259" w:lineRule="auto"/>
+        <w:ind w:left="288" w:hanging="216"/>
+      </w:pPr>
+      <w:r>
+        <w:rPr>
+          <w:rFonts w:ascii="Calibri" w:hAnsi="Calibri"/>
+          <w:b w:val="0"/>
+          <w:i w:val="0"/>
+          <w:color w:val="1A5C6E"/>
+          <w:sz w:val="20"/>
+        </w:rPr>
+        <w:t xml:space="preserve">•  </w:t>
+      </w:r>
+      <w:r>
+        <w:rPr>
+          <w:rFonts w:ascii="Calibri" w:hAnsi="Calibri"/>
+          <w:b w:val="0"/>
+          <w:i w:val="0"/>
+          <w:sz w:val="20"/>
+        </w:rPr>
+        <w:t>Developed and managed a Texas/Louisiana sales territory for B&amp;K Vibro; delivered vibration analysis and product training to 100+ clients and 20+ employees</w:t>
+      </w:r>
+    </w:p>
+    <w:p>
+      <w:pPr>
+        <w:spacing w:after="0" w:before="0" w:line="259" w:lineRule="auto"/>
+        <w:ind w:left="288" w:hanging="216"/>
+      </w:pPr>
+      <w:r>
+        <w:rPr>
+          <w:rFonts w:ascii="Calibri" w:hAnsi="Calibri"/>
+          <w:b w:val="0"/>
+          <w:i w:val="0"/>
+          <w:color w:val="1A5C6E"/>
+          <w:sz w:val="20"/>
+        </w:rPr>
+        <w:t xml:space="preserve">•  </w:t>
+      </w:r>
+      <w:r>
+        <w:rPr>
+          <w:rFonts w:ascii="Calibri" w:hAnsi="Calibri"/>
+          <w:b w:val="0"/>
+          <w:i w:val="0"/>
+          <w:sz w:val="20"/>
+        </w:rPr>
+        <w:t>Managed 200+ client accounts and processed thousands of orders at Metrix Instrument Company — maintained highest data entry accuracy (&gt;1,000 records) among service team</w:t>
+      </w:r>
+    </w:p>
+    <w:p>
+      <w:pPr>
+        <w:spacing w:after="0" w:before="0" w:line="259" w:lineRule="auto"/>
+        <w:ind w:left="288" w:hanging="216"/>
+      </w:pPr>
+      <w:r>
+        <w:rPr>
+          <w:rFonts w:ascii="Calibri" w:hAnsi="Calibri"/>
+          <w:b w:val="0"/>
+          <w:i w:val="0"/>
+          <w:color w:val="1A5C6E"/>
+          <w:sz w:val="20"/>
+        </w:rPr>
+        <w:t xml:space="preserve">•  </w:t>
+      </w:r>
+      <w:r>
+        <w:rPr>
+          <w:rFonts w:ascii="Calibri" w:hAnsi="Calibri"/>
+          <w:b w:val="0"/>
+          <w:i w:val="0"/>
+          <w:sz w:val="20"/>
+        </w:rPr>
+        <w:t>Achieved Vibration Analyst Level 2 certification through self-study; trained internal personnel on vibration data analysis and problem-solving</w:t>
+      </w:r>
+    </w:p>
+    <w:p>
+      <w:pPr>
+        <w:spacing w:after="0" w:before="0" w:line="259" w:lineRule="auto"/>
+        <w:ind w:left="288" w:hanging="216"/>
+      </w:pPr>
+      <w:r>
+        <w:rPr>
+          <w:rFonts w:ascii="Calibri" w:hAnsi="Calibri"/>
+          <w:b w:val="0"/>
+          <w:i w:val="0"/>
+          <w:color w:val="1A5C6E"/>
+          <w:sz w:val="20"/>
+        </w:rPr>
+        <w:t xml:space="preserve">•  </w:t>
+      </w:r>
+      <w:r>
+        <w:rPr>
+          <w:rFonts w:ascii="Calibri" w:hAnsi="Calibri"/>
+          <w:b w:val="0"/>
+          <w:i w:val="0"/>
+          <w:sz w:val="20"/>
+        </w:rPr>
+        <w:t>Mastered and integrated 3D modeling software into legacy systems — incorporated CAD, CAM, MS Access, and Excel into one cohesive process; developed SOPs and trained majority Spanish-speaking staff</w:t>
+      </w:r>
+    </w:p>
+    <w:p>
+      <w:pPr>
+        <w:spacing w:after="0" w:before="0" w:line="259" w:lineRule="auto"/>
+        <w:ind w:left="288" w:hanging="216"/>
+      </w:pPr>
+      <w:r>
+        <w:rPr>
+          <w:rFonts w:ascii="Calibri" w:hAnsi="Calibri"/>
+          <w:b w:val="0"/>
+          <w:i w:val="0"/>
+          <w:color w:val="1A5C6E"/>
+          <w:sz w:val="20"/>
+        </w:rPr>
+        <w:t xml:space="preserve">•  </w:t>
+      </w:r>
+      <w:r>
+        <w:rPr>
+          <w:rFonts w:ascii="Calibri" w:hAnsi="Calibri"/>
+          <w:b w:val="0"/>
+          <w:i w:val="0"/>
+          <w:sz w:val="20"/>
+        </w:rPr>
+        <w:t>Provided IT support at Texas A&amp;M University Help Desk; promoted to Lead Specialist</w:t>
+      </w:r>
+    </w:p>
+    <w:p>
+      <w:pPr>
+        <w:spacing w:after="60" w:before="200" w:line="259" w:lineRule="auto"/>
+        <w:pBdr>
+          <w:bottom w:val="single" w:sz="4" w:space="2" w:color="999999"/>
+        </w:pBdr>
+      </w:pPr>
+      <w:r>
+        <w:rPr>
+          <w:rFonts w:ascii="Calibri" w:hAnsi="Calibri"/>
+          <w:b/>
+          <w:i w:val="0"/>
+          <w:color w:val="1A1A2E"/>
+          <w:sz w:val="21"/>
+        </w:rPr>
+        <w:t>TECHNICAL SKILLS</w:t>
+      </w:r>
+    </w:p>
+    <w:p>
+      <w:pPr>
+        <w:spacing w:after="40" w:before="40" w:line="300" w:lineRule="auto"/>
+      </w:pPr>
+      <w:r>
+        <w:rPr>
+          <w:rFonts w:ascii="Calibri" w:hAnsi="Calibri"/>
+          <w:b/>
+          <w:i w:val="0"/>
+          <w:sz w:val="20"/>
+        </w:rPr>
+        <w:t>Past Performance Analysis</w:t>
+      </w:r>
+      <w:r>
+        <w:rPr>
+          <w:rFonts w:ascii="Calibri" w:hAnsi="Calibri"/>
+          <w:b w:val="0"/>
+          <w:i w:val="0"/>
+          <w:sz w:val="19"/>
+        </w:rPr>
+        <w:t xml:space="preserve">  |  Adverse Performance Narratives  |  Compliance Review  |  Proposal Management  |  Capture Support  |  Contract Strengths Analysis</w:t>
+      </w:r>
+    </w:p>
+    <w:p>
+      <w:pPr>
+        <w:spacing w:after="40" w:line="300" w:lineRule="auto"/>
+      </w:pPr>
+      <w:r>
+        <w:rPr>
+          <w:rFonts w:ascii="Calibri" w:hAnsi="Calibri"/>
+          <w:b/>
+          <w:i w:val="0"/>
           <w:sz w:val="20"/>
         </w:rPr>
         <w:t xml:space="preserve">Tools: </w:t>
@@ -99,832 +1002,40 @@
         <w:rPr>
           <w:rFonts w:ascii="Calibri" w:hAnsi="Calibri"/>
           <w:b w:val="0"/>
-          <w:sz w:val="20"/>
+          <w:i w:val="0"/>
+          <w:sz w:val="19"/>
         </w:rPr>
-        <w:t>Salesforce.com CRM | MS PowerBI | MS Project | MS Excel | MS PowerPoint | MS Word | MS SharePoint | MS Teams | MS OneDrive | Trello Kanban | Adobe Acrobat Pro | Adobe Photoshop | Adobe Lightroom | Google Suite | DocuSign | Zoom</w:t>
+        <w:t>Salesforce CRM  |  MS PowerBI  |  MS Project  |  MS Excel  |  MS SharePoint  |  MS Teams  |  Trello  |  Adobe Acrobat Pro  |  Google Suite  |  DocuSign</w:t>
       </w:r>
     </w:p>
     <w:p>
       <w:pPr>
-        <w:spacing w:after="40" w:before="240" w:line="276" w:lineRule="auto"/>
+        <w:spacing w:after="60" w:before="200" w:line="259" w:lineRule="auto"/>
         <w:pBdr>
-          <w:bottom w:val="single" w:sz="6" w:space="1" w:color="1a1a1a"/>
+          <w:bottom w:val="single" w:sz="4" w:space="2" w:color="999999"/>
         </w:pBdr>
       </w:pPr>
       <w:r>
         <w:rPr>
           <w:rFonts w:ascii="Calibri" w:hAnsi="Calibri"/>
           <w:b/>
-          <w:sz w:val="24"/>
+          <w:i w:val="0"/>
+          <w:color w:val="1A1A2E"/>
+          <w:sz w:val="21"/>
         </w:rPr>
-        <w:t>WORK EXPERIENCE</w:t>
+        <w:t>EDUCATION &amp; CERTIFICATIONS</w:t>
       </w:r>
     </w:p>
     <w:p>
       <w:pPr>
-        <w:spacing w:after="0" w:before="0" w:line="276" w:lineRule="auto"/>
-      </w:pPr>
-      <w:r>
-        <w:rPr>
-          <w:rFonts w:ascii="Calibri" w:hAnsi="Calibri"/>
-          <w:b w:val="0"/>
-          <w:sz w:val="20"/>
-        </w:rPr>
-        <w:t>Kellogg Brown &amp; Root (KBR, Inc.), Moorpark, CA</w:t>
-      </w:r>
-    </w:p>
-    <w:p>
-      <w:pPr>
-        <w:spacing w:after="40" w:before="0" w:line="276" w:lineRule="auto"/>
+        <w:spacing w:after="20" w:before="40" w:line="276" w:lineRule="auto"/>
       </w:pPr>
       <w:r>
         <w:rPr>
           <w:rFonts w:ascii="Calibri" w:hAnsi="Calibri"/>
           <w:b/>
-          <w:sz w:val="20"/>
-        </w:rPr>
-        <w:t>Senior Proposals Specialist</w:t>
-      </w:r>
-      <w:r>
-        <w:rPr>
-          <w:rFonts w:ascii="Calibri" w:hAnsi="Calibri"/>
-          <w:b w:val="0"/>
-          <w:sz w:val="20"/>
-        </w:rPr>
-        <w:t xml:space="preserve"> — Mar 2022 – Present</w:t>
-      </w:r>
-    </w:p>
-    <w:p>
-      <w:pPr>
-        <w:spacing w:after="0" w:before="60" w:line="276" w:lineRule="auto"/>
-      </w:pPr>
-      <w:r>
-        <w:rPr>
-          <w:rFonts w:ascii="Calibri" w:hAnsi="Calibri"/>
-          <w:b/>
-          <w:sz w:val="20"/>
-        </w:rPr>
-        <w:t>Focus:</w:t>
-      </w:r>
-    </w:p>
-    <w:p>
-      <w:pPr>
-        <w:spacing w:after="20" w:before="0" w:line="276" w:lineRule="auto"/>
-      </w:pPr>
-      <w:r>
-        <w:rPr>
-          <w:rFonts w:ascii="Calibri" w:hAnsi="Calibri"/>
-          <w:b w:val="0"/>
-          <w:sz w:val="20"/>
-        </w:rPr>
-        <w:t>Lead past performance and adverse performance narrative development for large-scale government proposals. Supported 10+ opportunities representing over $2.9B in aggregate contract value — contributing past performance volumes, compliance reviews, and capture-phase support.</w:t>
-      </w:r>
-    </w:p>
-    <w:p>
-      <w:pPr>
-        <w:spacing w:after="20" w:before="0" w:line="276" w:lineRule="auto"/>
-      </w:pPr>
-      <w:r>
-        <w:rPr>
-          <w:rFonts w:ascii="Calibri" w:hAnsi="Calibri"/>
-          <w:b w:val="0"/>
-          <w:sz w:val="20"/>
-        </w:rPr>
-        <w:t>Directed adverse past performance collection and analysis across multiple predecessor contracts spanning CONUS and OCONUS sites. Synthesized letters of concern, corrective action reports, Cure Notices, and CPARs into compliant recovery narratives under compressed page constraints.</w:t>
-      </w:r>
-    </w:p>
-    <w:p>
-      <w:pPr>
-        <w:spacing w:after="20" w:before="0" w:line="276" w:lineRule="auto"/>
-      </w:pPr>
-      <w:r>
-        <w:rPr>
-          <w:rFonts w:ascii="Calibri" w:hAnsi="Calibri"/>
-          <w:b w:val="0"/>
-          <w:sz w:val="20"/>
-        </w:rPr>
-        <w:t>Contributed to RFI development, contract strengths analysis, glide-path solutioning, and color-team milestone reviews (Pink/Red Team) for early-phase captures including a $600M+ commercial services pursuit.</w:t>
-      </w:r>
-    </w:p>
-    <w:p>
-      <w:pPr>
-        <w:spacing w:after="20" w:before="0" w:line="276" w:lineRule="auto"/>
-      </w:pPr>
-      <w:r>
-        <w:rPr>
-          <w:rFonts w:ascii="Calibri" w:hAnsi="Calibri"/>
-          <w:b w:val="0"/>
-          <w:sz w:val="20"/>
-        </w:rPr>
-        <w:t>Maintained cross-functional compliance trackers for multi-volume submissions and served as independent reviewer (IPR) for corporate experience sections.</w:t>
-      </w:r>
-    </w:p>
-    <w:p>
-      <w:pPr>
-        <w:spacing w:after="0" w:before="60" w:line="276" w:lineRule="auto"/>
-      </w:pPr>
-      <w:r>
-        <w:rPr>
-          <w:rFonts w:ascii="Calibri" w:hAnsi="Calibri"/>
-          <w:b/>
-          <w:sz w:val="20"/>
-        </w:rPr>
-        <w:t>Achievements:</w:t>
-      </w:r>
-    </w:p>
-    <w:p>
-      <w:pPr>
-        <w:spacing w:after="20" w:before="0" w:line="276" w:lineRule="auto"/>
-      </w:pPr>
-      <w:r>
-        <w:rPr>
-          <w:rFonts w:ascii="Calibri" w:hAnsi="Calibri"/>
-          <w:b w:val="0"/>
-          <w:sz w:val="20"/>
-        </w:rPr>
-        <w:t>2022–2026: Served as Past Performance Lead on major contested re-competes, coordinating data calls across geographically distributed program teams and navigating complex adverse performance recovery narratives.</w:t>
-      </w:r>
-    </w:p>
-    <w:p>
-      <w:pPr>
-        <w:spacing w:after="0" w:before="120" w:line="276" w:lineRule="auto"/>
-      </w:pPr>
-      <w:r>
-        <w:rPr>
-          <w:rFonts w:ascii="Calibri" w:hAnsi="Calibri"/>
-          <w:b w:val="0"/>
-          <w:sz w:val="20"/>
-        </w:rPr>
-        <w:t>Brüel &amp; Kjær Vibro (B&amp;K Vibro), Houston, TX</w:t>
-      </w:r>
-    </w:p>
-    <w:p>
-      <w:pPr>
-        <w:spacing w:after="40" w:before="0" w:line="276" w:lineRule="auto"/>
-      </w:pPr>
-      <w:r>
-        <w:rPr>
-          <w:rFonts w:ascii="Calibri" w:hAnsi="Calibri"/>
-          <w:b/>
-          <w:sz w:val="20"/>
-        </w:rPr>
-        <w:t>Sales &amp; Operations Manager</w:t>
-      </w:r>
-      <w:r>
-        <w:rPr>
-          <w:rFonts w:ascii="Calibri" w:hAnsi="Calibri"/>
-          <w:b w:val="0"/>
-          <w:sz w:val="20"/>
-        </w:rPr>
-        <w:t xml:space="preserve"> — Aug 2018 – Feb 2022</w:t>
-      </w:r>
-    </w:p>
-    <w:p>
-      <w:pPr>
-        <w:spacing w:after="0" w:before="60" w:line="276" w:lineRule="auto"/>
-      </w:pPr>
-      <w:r>
-        <w:rPr>
-          <w:rFonts w:ascii="Calibri" w:hAnsi="Calibri"/>
-          <w:b/>
-          <w:sz w:val="20"/>
-        </w:rPr>
-        <w:t>Focus:</w:t>
-      </w:r>
-    </w:p>
-    <w:p>
-      <w:pPr>
-        <w:spacing w:after="20" w:before="0" w:line="276" w:lineRule="auto"/>
-      </w:pPr>
-      <w:r>
-        <w:rPr>
-          <w:rFonts w:ascii="Calibri" w:hAnsi="Calibri"/>
-          <w:b w:val="0"/>
-          <w:sz w:val="20"/>
-        </w:rPr>
-        <w:t>Developed and managed tools and processes for a global sales team of over 40 individuals in every continent.</w:t>
-      </w:r>
-    </w:p>
-    <w:p>
-      <w:pPr>
-        <w:spacing w:after="20" w:before="0" w:line="276" w:lineRule="auto"/>
-      </w:pPr>
-      <w:r>
-        <w:rPr>
-          <w:rFonts w:ascii="Calibri" w:hAnsi="Calibri"/>
-          <w:b w:val="0"/>
-          <w:sz w:val="20"/>
-        </w:rPr>
-        <w:t>Acted as Salesforce Administrator since 2019 to continually improve customer relationship management (CRM). Generated sales forecasting reports and dashboards, including reports detailing leading indicators of sales performance to identify improvement opportunities.</w:t>
-      </w:r>
-    </w:p>
-    <w:p>
-      <w:pPr>
-        <w:spacing w:after="20" w:before="0" w:line="276" w:lineRule="auto"/>
-      </w:pPr>
-      <w:r>
-        <w:rPr>
-          <w:rFonts w:ascii="Calibri" w:hAnsi="Calibri"/>
-          <w:b w:val="0"/>
-          <w:sz w:val="20"/>
-        </w:rPr>
-        <w:t>Managed all proposal development across the Americas with signature authority for budgetary proposals up to $500k.</w:t>
-      </w:r>
-    </w:p>
-    <w:p>
-      <w:pPr>
-        <w:spacing w:after="20" w:before="0" w:line="276" w:lineRule="auto"/>
-      </w:pPr>
-      <w:r>
-        <w:rPr>
-          <w:rFonts w:ascii="Calibri" w:hAnsi="Calibri"/>
-          <w:b w:val="0"/>
-          <w:sz w:val="20"/>
-        </w:rPr>
-        <w:t>Developed agendas, organized, and managed sales team meetings on a weekly/monthly/quarterly basis along with the Americas General Manager. Recorded detailed meeting minutes and followed up by assigning action items.</w:t>
-      </w:r>
-    </w:p>
-    <w:p>
-      <w:pPr>
-        <w:spacing w:after="20" w:before="0" w:line="276" w:lineRule="auto"/>
-      </w:pPr>
-      <w:r>
-        <w:rPr>
-          <w:rFonts w:ascii="Calibri" w:hAnsi="Calibri"/>
-          <w:b w:val="0"/>
-          <w:sz w:val="20"/>
-        </w:rPr>
-        <w:t>Developed a business strategy and managed the western US sales region covering 17 states — focusing on companies in the oil &amp; gas, petrochemical, and power generation industries. Discovered and developed opportunities with over $1M in revenue potential.</w:t>
-      </w:r>
-    </w:p>
-    <w:p>
-      <w:pPr>
-        <w:spacing w:after="0" w:before="60" w:line="276" w:lineRule="auto"/>
-      </w:pPr>
-      <w:r>
-        <w:rPr>
-          <w:rFonts w:ascii="Calibri" w:hAnsi="Calibri"/>
-          <w:b/>
-          <w:sz w:val="20"/>
-        </w:rPr>
-        <w:t>Achievements:</w:t>
-      </w:r>
-    </w:p>
-    <w:p>
-      <w:pPr>
-        <w:spacing w:after="20" w:before="0" w:line="276" w:lineRule="auto"/>
-      </w:pPr>
-      <w:r>
-        <w:rPr>
-          <w:rFonts w:ascii="Calibri" w:hAnsi="Calibri"/>
-          <w:b w:val="0"/>
-          <w:sz w:val="20"/>
-        </w:rPr>
-        <w:t>2021: Developed training material and led training sessions for over 75 sales managers unfamiliar with our business.</w:t>
-      </w:r>
-    </w:p>
-    <w:p>
-      <w:pPr>
-        <w:spacing w:after="20" w:before="0" w:line="276" w:lineRule="auto"/>
-      </w:pPr>
-      <w:r>
-        <w:rPr>
-          <w:rFonts w:ascii="Calibri" w:hAnsi="Calibri"/>
-          <w:b w:val="0"/>
-          <w:sz w:val="20"/>
-        </w:rPr>
-        <w:t>2021: Developed FY2022 business planning resources for the Americas sales team with a forecast of over $7M.</w:t>
-      </w:r>
-    </w:p>
-    <w:p>
-      <w:pPr>
-        <w:spacing w:after="20" w:before="0" w:line="276" w:lineRule="auto"/>
-      </w:pPr>
-      <w:r>
-        <w:rPr>
-          <w:rFonts w:ascii="Calibri" w:hAnsi="Calibri"/>
-          <w:b w:val="0"/>
-          <w:sz w:val="20"/>
-        </w:rPr>
-        <w:t>2020: Project Manager for a $4M proposal to a South American customer involving resources from Denmark, Germany, and Brazil — including C-suite executives at B&amp;K Vibro.</w:t>
-      </w:r>
-    </w:p>
-    <w:p>
-      <w:pPr>
-        <w:spacing w:after="20" w:before="0" w:line="276" w:lineRule="auto"/>
-      </w:pPr>
-      <w:r>
-        <w:rPr>
-          <w:rFonts w:ascii="Calibri" w:hAnsi="Calibri"/>
-          <w:b w:val="0"/>
-          <w:sz w:val="20"/>
-        </w:rPr>
-        <w:t>2019: Project Manager for implementing and transitioning to a new CRM within a 6-month deadline.</w:t>
-      </w:r>
-    </w:p>
-    <w:p>
-      <w:pPr>
-        <w:spacing w:after="20" w:before="0" w:line="276" w:lineRule="auto"/>
-      </w:pPr>
-      <w:r>
-        <w:rPr>
-          <w:rFonts w:ascii="Calibri" w:hAnsi="Calibri"/>
-          <w:b w:val="0"/>
-          <w:sz w:val="20"/>
-        </w:rPr>
-        <w:t>2019: Led the planning and execution of the sales team and channel partner annual meeting in Gardnerville, NV.</w:t>
-      </w:r>
-    </w:p>
-    <w:p>
-      <w:pPr>
-        <w:spacing w:after="0" w:before="120" w:line="276" w:lineRule="auto"/>
-      </w:pPr>
-      <w:r>
-        <w:rPr>
-          <w:rFonts w:ascii="Calibri" w:hAnsi="Calibri"/>
-          <w:b w:val="0"/>
-          <w:sz w:val="20"/>
-        </w:rPr>
-        <w:t>Kellogg Brown &amp; Root (KBR, Inc.), Houston, TX</w:t>
-      </w:r>
-    </w:p>
-    <w:p>
-      <w:pPr>
-        <w:spacing w:after="40" w:before="0" w:line="276" w:lineRule="auto"/>
-      </w:pPr>
-      <w:r>
-        <w:rPr>
-          <w:rFonts w:ascii="Calibri" w:hAnsi="Calibri"/>
-          <w:b/>
-          <w:sz w:val="20"/>
-        </w:rPr>
-        <w:t>Proposal Specialist / Project Manager</w:t>
-      </w:r>
-      <w:r>
-        <w:rPr>
-          <w:rFonts w:ascii="Calibri" w:hAnsi="Calibri"/>
-          <w:b w:val="0"/>
-          <w:sz w:val="20"/>
-        </w:rPr>
-        <w:t xml:space="preserve"> — Jul 2016 – Jul 2018</w:t>
-      </w:r>
-    </w:p>
-    <w:p>
-      <w:pPr>
-        <w:spacing w:after="0" w:before="60" w:line="276" w:lineRule="auto"/>
-      </w:pPr>
-      <w:r>
-        <w:rPr>
-          <w:rFonts w:ascii="Calibri" w:hAnsi="Calibri"/>
-          <w:b/>
-          <w:sz w:val="20"/>
-        </w:rPr>
-        <w:t>Focus:</w:t>
-      </w:r>
-    </w:p>
-    <w:p>
-      <w:pPr>
-        <w:spacing w:after="20" w:before="0" w:line="276" w:lineRule="auto"/>
-      </w:pPr>
-      <w:r>
-        <w:rPr>
-          <w:rFonts w:ascii="Calibri" w:hAnsi="Calibri"/>
-          <w:b w:val="0"/>
-          <w:sz w:val="20"/>
-        </w:rPr>
-        <w:t>Managed complex proposal development across multiple KBR functions throughout the organization. Supported sales, capture, and business development process of KBR's proposal team, including direct involvement in technical and concept operations solutioning, win theme, differentiator development, and management review coordination.</w:t>
-      </w:r>
-    </w:p>
-    <w:p>
-      <w:pPr>
-        <w:spacing w:after="20" w:before="0" w:line="276" w:lineRule="auto"/>
-      </w:pPr>
-      <w:r>
-        <w:rPr>
-          <w:rFonts w:ascii="Calibri" w:hAnsi="Calibri"/>
-          <w:b w:val="0"/>
-          <w:sz w:val="20"/>
-        </w:rPr>
-        <w:t>Designed project operations schedules (e.g., Gantt charts) for mobilizing and executing complex military-focused projects across the world ranging from $1M to $10M.</w:t>
-      </w:r>
-    </w:p>
-    <w:p>
-      <w:pPr>
-        <w:spacing w:after="20" w:before="0" w:line="276" w:lineRule="auto"/>
-      </w:pPr>
-      <w:r>
-        <w:rPr>
-          <w:rFonts w:ascii="Calibri" w:hAnsi="Calibri"/>
-          <w:b w:val="0"/>
-          <w:sz w:val="20"/>
-        </w:rPr>
-        <w:t>Coordinated and interviewed internal technical leads to ensure proposals were thorough and compelling. Researched KBR, Air Force, Navy, Army, and other Department of Defense (DoD) standard operating procedures (SOPs) and quality standards.</w:t>
-      </w:r>
-    </w:p>
-    <w:p>
-      <w:pPr>
-        <w:spacing w:after="20" w:before="0" w:line="276" w:lineRule="auto"/>
-      </w:pPr>
-      <w:r>
-        <w:rPr>
-          <w:rFonts w:ascii="Calibri" w:hAnsi="Calibri"/>
-          <w:b w:val="0"/>
-          <w:sz w:val="20"/>
-        </w:rPr>
-        <w:t>Maintained and organized MS SharePoint portal, web pages, and document libraries to deliver proposal projects.</w:t>
-      </w:r>
-    </w:p>
-    <w:p>
-      <w:pPr>
-        <w:spacing w:after="0" w:before="60" w:line="276" w:lineRule="auto"/>
-      </w:pPr>
-      <w:r>
-        <w:rPr>
-          <w:rFonts w:ascii="Calibri" w:hAnsi="Calibri"/>
-          <w:b/>
-          <w:sz w:val="20"/>
-        </w:rPr>
-        <w:t>Achievements:</w:t>
-      </w:r>
-    </w:p>
-    <w:p>
-      <w:pPr>
-        <w:spacing w:after="20" w:before="0" w:line="276" w:lineRule="auto"/>
-      </w:pPr>
-      <w:r>
-        <w:rPr>
-          <w:rFonts w:ascii="Calibri" w:hAnsi="Calibri"/>
-          <w:b w:val="0"/>
-          <w:sz w:val="20"/>
-        </w:rPr>
-        <w:t>2018: Analyzed KBR's asset management and supply chain data, resulting in special prioritized improvements to optimize the global program.</w:t>
-      </w:r>
-    </w:p>
-    <w:p>
-      <w:pPr>
-        <w:spacing w:after="20" w:before="0" w:line="276" w:lineRule="auto"/>
-      </w:pPr>
-      <w:r>
-        <w:rPr>
-          <w:rFonts w:ascii="Calibri" w:hAnsi="Calibri"/>
-          <w:b w:val="0"/>
-          <w:sz w:val="20"/>
-        </w:rPr>
-        <w:t>2016–2018: Participated in 10+ individual submittal opportunities by writing and editing proposals, scheduling meetings, and conducting interviews; all of these opportunities would bring $2.9B in revenue to KBR.</w:t>
-      </w:r>
-    </w:p>
-    <w:p>
-      <w:pPr>
-        <w:spacing w:after="0" w:before="120" w:line="276" w:lineRule="auto"/>
-      </w:pPr>
-      <w:r>
-        <w:rPr>
-          <w:rFonts w:ascii="Calibri" w:hAnsi="Calibri"/>
-          <w:b w:val="0"/>
-          <w:sz w:val="20"/>
-        </w:rPr>
-        <w:t>Kellogg Brown &amp; Root (KBR, Inc.), Houston, TX</w:t>
-      </w:r>
-    </w:p>
-    <w:p>
-      <w:pPr>
-        <w:spacing w:after="40" w:before="0" w:line="276" w:lineRule="auto"/>
-      </w:pPr>
-      <w:r>
-        <w:rPr>
-          <w:rFonts w:ascii="Calibri" w:hAnsi="Calibri"/>
-          <w:b/>
-          <w:sz w:val="20"/>
-        </w:rPr>
-        <w:t>Mechanical Engineer / Project Manager</w:t>
-      </w:r>
-      <w:r>
-        <w:rPr>
-          <w:rFonts w:ascii="Calibri" w:hAnsi="Calibri"/>
-          <w:b w:val="0"/>
-          <w:sz w:val="20"/>
-        </w:rPr>
-        <w:t xml:space="preserve"> — Mar 2013 – Jul 2016</w:t>
-      </w:r>
-    </w:p>
-    <w:p>
-      <w:pPr>
-        <w:spacing w:after="0" w:before="60" w:line="276" w:lineRule="auto"/>
-      </w:pPr>
-      <w:r>
-        <w:rPr>
-          <w:rFonts w:ascii="Calibri" w:hAnsi="Calibri"/>
-          <w:b/>
-          <w:sz w:val="20"/>
-        </w:rPr>
-        <w:t>Focus:</w:t>
-      </w:r>
-    </w:p>
-    <w:p>
-      <w:pPr>
-        <w:spacing w:after="20" w:before="0" w:line="276" w:lineRule="auto"/>
-      </w:pPr>
-      <w:r>
-        <w:rPr>
-          <w:rFonts w:ascii="Calibri" w:hAnsi="Calibri"/>
-          <w:b w:val="0"/>
-          <w:sz w:val="20"/>
-        </w:rPr>
-        <w:t>Led technical bid analysis activities by incorporating corporate and industry standards and facilitating bid conditioning meetings with equipment vendors.</w:t>
-      </w:r>
-    </w:p>
-    <w:p>
-      <w:pPr>
-        <w:spacing w:after="20" w:before="0" w:line="276" w:lineRule="auto"/>
-      </w:pPr>
-      <w:r>
-        <w:rPr>
-          <w:rFonts w:ascii="Calibri" w:hAnsi="Calibri"/>
-          <w:b w:val="0"/>
-          <w:sz w:val="20"/>
-        </w:rPr>
-        <w:t>Performed root-cause analysis of complex equipment and coordinated with internal experts, stakeholders, external vendors, and other resources to implement resolutions.</w:t>
-      </w:r>
-    </w:p>
-    <w:p>
-      <w:pPr>
-        <w:spacing w:after="20" w:before="0" w:line="276" w:lineRule="auto"/>
-      </w:pPr>
-      <w:r>
-        <w:rPr>
-          <w:rFonts w:ascii="Calibri" w:hAnsi="Calibri"/>
-          <w:b w:val="0"/>
-          <w:sz w:val="20"/>
-        </w:rPr>
-        <w:t>Commissioned equipment in the field by measuring key equipment data metrics, performing system efficiency calculations, and recommending equipment acceptance to leadership.</w:t>
-      </w:r>
-    </w:p>
-    <w:p>
-      <w:pPr>
-        <w:spacing w:after="20" w:before="0" w:line="276" w:lineRule="auto"/>
-      </w:pPr>
-      <w:r>
-        <w:rPr>
-          <w:rFonts w:ascii="Calibri" w:hAnsi="Calibri"/>
-          <w:b w:val="0"/>
-          <w:sz w:val="20"/>
-        </w:rPr>
-        <w:t>Managed project progress and milestone tracking — ensuring specific deliverables were completed on-time.</w:t>
-      </w:r>
-    </w:p>
-    <w:p>
-      <w:pPr>
-        <w:spacing w:after="0" w:before="60" w:line="276" w:lineRule="auto"/>
-      </w:pPr>
-      <w:r>
-        <w:rPr>
-          <w:rFonts w:ascii="Calibri" w:hAnsi="Calibri"/>
-          <w:b/>
-          <w:sz w:val="20"/>
-        </w:rPr>
-        <w:t>Achievements:</w:t>
-      </w:r>
-    </w:p>
-    <w:p>
-      <w:pPr>
-        <w:spacing w:after="20" w:before="0" w:line="276" w:lineRule="auto"/>
-      </w:pPr>
-      <w:r>
-        <w:rPr>
-          <w:rFonts w:ascii="Calibri" w:hAnsi="Calibri"/>
-          <w:b w:val="0"/>
-          <w:sz w:val="20"/>
-        </w:rPr>
-        <w:t>2016: Managed a team of 10 millwrights and electricians in a dynamic environment to commission and repair complex equipment at an ammonia plant near New Orleans, LA.</w:t>
-      </w:r>
-    </w:p>
-    <w:p>
-      <w:pPr>
-        <w:spacing w:after="20" w:before="0" w:line="276" w:lineRule="auto"/>
-      </w:pPr>
-      <w:r>
-        <w:rPr>
-          <w:rFonts w:ascii="Calibri" w:hAnsi="Calibri"/>
-          <w:b w:val="0"/>
-          <w:sz w:val="20"/>
-        </w:rPr>
-        <w:t>2016: Identified and analyzed complex bearing seal failure by gathering data and connecting vendors and senior leadership. Determined the root-cause failure and incorporated countermeasures to solve the issue within weeks.</w:t>
-      </w:r>
-    </w:p>
-    <w:p>
-      <w:pPr>
-        <w:spacing w:after="20" w:before="0" w:line="276" w:lineRule="auto"/>
-      </w:pPr>
-      <w:r>
-        <w:rPr>
-          <w:rFonts w:ascii="Calibri" w:hAnsi="Calibri"/>
-          <w:b w:val="0"/>
-          <w:sz w:val="20"/>
-        </w:rPr>
-        <w:t>2015: Led daily stand-up meetings and managed the project scheduling and milestone tracking for an $850 million plant expansion project near Houston, TX.</w:t>
-      </w:r>
-    </w:p>
-    <w:p>
-      <w:pPr>
-        <w:spacing w:after="20" w:before="0" w:line="276" w:lineRule="auto"/>
-      </w:pPr>
-      <w:r>
-        <w:rPr>
-          <w:rFonts w:ascii="Calibri" w:hAnsi="Calibri"/>
-          <w:b w:val="0"/>
-          <w:sz w:val="20"/>
-        </w:rPr>
-        <w:t>2014: Project Manager for updating KBR's technical standards for cooling towers to comply with new industrial standards and US government regulations.</w:t>
-      </w:r>
-    </w:p>
-    <w:p>
-      <w:pPr>
-        <w:spacing w:after="20" w:before="0" w:line="276" w:lineRule="auto"/>
-      </w:pPr>
-      <w:r>
-        <w:rPr>
-          <w:rFonts w:ascii="Calibri" w:hAnsi="Calibri"/>
-          <w:b w:val="0"/>
-          <w:sz w:val="20"/>
-        </w:rPr>
-        <w:t>2013–2014: Incorporated mechanical engineering to evaluate over 50 detailed technical documents and develop formal bid analyses for review by Principal Engineers.</w:t>
-      </w:r>
-    </w:p>
-    <w:p>
-      <w:pPr>
-        <w:spacing w:after="0" w:before="120" w:line="276" w:lineRule="auto"/>
-      </w:pPr>
-      <w:r>
-        <w:rPr>
-          <w:rFonts w:ascii="Calibri" w:hAnsi="Calibri"/>
-          <w:b w:val="0"/>
-          <w:sz w:val="20"/>
-        </w:rPr>
-        <w:t>B&amp;K Vibro, Metrix Instrument Company, Texas A&amp;M University, and others — Texas</w:t>
-      </w:r>
-    </w:p>
-    <w:p>
-      <w:pPr>
-        <w:spacing w:after="40" w:before="0" w:line="276" w:lineRule="auto"/>
-      </w:pPr>
-      <w:r>
-        <w:rPr>
-          <w:rFonts w:ascii="Calibri" w:hAnsi="Calibri"/>
-          <w:b/>
-          <w:sz w:val="20"/>
-        </w:rPr>
-        <w:t>Sales Engineer / Inside Technical Sales / IT Support / CAD-CAM Programmer</w:t>
-      </w:r>
-      <w:r>
-        <w:rPr>
-          <w:rFonts w:ascii="Calibri" w:hAnsi="Calibri"/>
-          <w:b w:val="0"/>
-          <w:sz w:val="20"/>
-        </w:rPr>
-        <w:t xml:space="preserve"> — 2005 – 2012</w:t>
-      </w:r>
-    </w:p>
-    <w:p>
-      <w:pPr>
-        <w:spacing w:after="0" w:before="60" w:line="276" w:lineRule="auto"/>
-      </w:pPr>
-      <w:r>
-        <w:rPr>
-          <w:rFonts w:ascii="Calibri" w:hAnsi="Calibri"/>
-          <w:b/>
-          <w:sz w:val="20"/>
-        </w:rPr>
-        <w:t>Focus:</w:t>
-      </w:r>
-    </w:p>
-    <w:p>
-      <w:pPr>
-        <w:spacing w:after="20" w:before="0" w:line="276" w:lineRule="auto"/>
-      </w:pPr>
-      <w:r>
-        <w:rPr>
-          <w:rFonts w:ascii="Calibri" w:hAnsi="Calibri"/>
-          <w:b w:val="0"/>
-          <w:sz w:val="20"/>
-        </w:rPr>
-        <w:t>Developed a business strategy and managed a sales territory covering Texas and Louisiana for B&amp;K Vibro.</w:t>
-      </w:r>
-    </w:p>
-    <w:p>
-      <w:pPr>
-        <w:spacing w:after="20" w:before="0" w:line="276" w:lineRule="auto"/>
-      </w:pPr>
-      <w:r>
-        <w:rPr>
-          <w:rFonts w:ascii="Calibri" w:hAnsi="Calibri"/>
-          <w:b w:val="0"/>
-          <w:sz w:val="20"/>
-        </w:rPr>
-        <w:t>Managed over 200 client accounts, processed thousands of orders, and coordinated with the supply chain department to review status and expedite orders at Metrix Instrument Company.</w:t>
-      </w:r>
-    </w:p>
-    <w:p>
-      <w:pPr>
-        <w:spacing w:after="20" w:before="0" w:line="276" w:lineRule="auto"/>
-      </w:pPr>
-      <w:r>
-        <w:rPr>
-          <w:rFonts w:ascii="Calibri" w:hAnsi="Calibri"/>
-          <w:b w:val="0"/>
-          <w:sz w:val="20"/>
-        </w:rPr>
-        <w:t>Provided quality customer technical engineering support for over 20 technically advanced measurement devices. Delivered vibration analysis and product training to over 100 potential clients and over 20 employees.</w:t>
-      </w:r>
-    </w:p>
-    <w:p>
-      <w:pPr>
-        <w:spacing w:after="20" w:before="0" w:line="276" w:lineRule="auto"/>
-      </w:pPr>
-      <w:r>
-        <w:rPr>
-          <w:rFonts w:ascii="Calibri" w:hAnsi="Calibri"/>
-          <w:b w:val="0"/>
-          <w:sz w:val="20"/>
-        </w:rPr>
-        <w:t>Mastered and integrated a new 3D modeling software into complex legacy systems from the ground-up. Incorporated CAD, CAM, MS Access databases, MS Excel, and other systems into one cohesive process. Developed data hierarchy strategy, created SOPs, and trained a majority Spanish-speaking staff in best practices.</w:t>
-      </w:r>
-    </w:p>
-    <w:p>
-      <w:pPr>
-        <w:spacing w:after="0" w:before="60" w:line="276" w:lineRule="auto"/>
-      </w:pPr>
-      <w:r>
-        <w:rPr>
-          <w:rFonts w:ascii="Calibri" w:hAnsi="Calibri"/>
-          <w:b/>
-          <w:sz w:val="20"/>
-        </w:rPr>
-        <w:t>Achievements:</w:t>
-      </w:r>
-    </w:p>
-    <w:p>
-      <w:pPr>
-        <w:spacing w:after="20" w:before="0" w:line="276" w:lineRule="auto"/>
-      </w:pPr>
-      <w:r>
-        <w:rPr>
-          <w:rFonts w:ascii="Calibri" w:hAnsi="Calibri"/>
-          <w:b w:val="0"/>
-          <w:sz w:val="20"/>
-        </w:rPr>
-        <w:t>2012: Achieved vibration analyst (level 2) certification with self-study and trained internal personnel on vibration data analysis and problem-solving fundamentals.</w:t>
-      </w:r>
-    </w:p>
-    <w:p>
-      <w:pPr>
-        <w:spacing w:after="20" w:before="0" w:line="276" w:lineRule="auto"/>
-      </w:pPr>
-      <w:r>
-        <w:rPr>
-          <w:rFonts w:ascii="Calibri" w:hAnsi="Calibri"/>
-          <w:b w:val="0"/>
-          <w:sz w:val="20"/>
-        </w:rPr>
-        <w:t>2012: Maintained the highest accurate data entry volume (&gt;1000 records) among the service team for tracking orders and service requests.</w:t>
-      </w:r>
-    </w:p>
-    <w:p>
-      <w:pPr>
-        <w:spacing w:after="20" w:before="0" w:line="276" w:lineRule="auto"/>
-      </w:pPr>
-      <w:r>
-        <w:rPr>
-          <w:rFonts w:ascii="Calibri" w:hAnsi="Calibri"/>
-          <w:b w:val="0"/>
-          <w:sz w:val="20"/>
-        </w:rPr>
-        <w:t>2011: Successfully implemented an efficient business process that leveraged modern technology in less than 1 year.</w:t>
-      </w:r>
-    </w:p>
-    <w:p>
-      <w:pPr>
-        <w:spacing w:after="40" w:before="240" w:line="276" w:lineRule="auto"/>
-        <w:pBdr>
-          <w:bottom w:val="single" w:sz="6" w:space="1" w:color="1a1a1a"/>
-        </w:pBdr>
-      </w:pPr>
-      <w:r>
-        <w:rPr>
-          <w:rFonts w:ascii="Calibri" w:hAnsi="Calibri"/>
-          <w:b/>
-          <w:sz w:val="24"/>
-        </w:rPr>
-        <w:t>EDUCATION</w:t>
-      </w:r>
-    </w:p>
-    <w:p>
-      <w:pPr>
-        <w:spacing w:after="20" w:before="0" w:line="276" w:lineRule="auto"/>
-      </w:pPr>
-      <w:r>
-        <w:rPr>
-          <w:rFonts w:ascii="Calibri" w:hAnsi="Calibri"/>
-          <w:b/>
+          <w:i w:val="0"/>
+          <w:color w:val="1A1A2E"/>
           <w:sz w:val="20"/>
         </w:rPr>
         <w:t>Texas A&amp;M University</w:t>
@@ -933,56 +1044,38 @@
         <w:rPr>
           <w:rFonts w:ascii="Calibri" w:hAnsi="Calibri"/>
           <w:b w:val="0"/>
-          <w:sz w:val="20"/>
+          <w:i w:val="0"/>
+          <w:sz w:val="19"/>
         </w:rPr>
-        <w:t>, College Station, TX (2010)</w:t>
+        <w:t xml:space="preserve">  —  College Station, TX  |  B.S. Manufacturing &amp; Mechanical Engineering Technology (MMET)  |  Dean's List, 2010</w:t>
       </w:r>
     </w:p>
     <w:p>
       <w:pPr>
-        <w:spacing w:after="80" w:before="0" w:line="276" w:lineRule="auto"/>
+        <w:spacing w:after="20" w:line="276" w:lineRule="auto"/>
       </w:pPr>
       <w:r>
         <w:rPr>
           <w:rFonts w:ascii="Calibri" w:hAnsi="Calibri"/>
           <w:b w:val="0"/>
-          <w:sz w:val="20"/>
+          <w:i w:val="0"/>
+          <w:sz w:val="19"/>
         </w:rPr>
-        <w:t>Bachelor of Science in Manufacturing and Mechanical Engineering Technology (MMET) — Dean's List</w:t>
+        <w:t>APMP Foundations Certified</w:t>
       </w:r>
-    </w:p>
-    <w:p>
-      <w:pPr>
-        <w:spacing w:after="40" w:before="240" w:line="276" w:lineRule="auto"/>
-        <w:pBdr>
-          <w:bottom w:val="single" w:sz="6" w:space="1" w:color="1a1a1a"/>
-        </w:pBdr>
-      </w:pPr>
-      <w:r>
-        <w:rPr>
-          <w:rFonts w:ascii="Calibri" w:hAnsi="Calibri"/>
-          <w:b/>
-          <w:sz w:val="24"/>
-        </w:rPr>
-        <w:t>CERTIFICATIONS</w:t>
-      </w:r>
-    </w:p>
-    <w:p>
-      <w:pPr>
-        <w:spacing w:after="0" w:before="0" w:line="276" w:lineRule="auto"/>
-      </w:pPr>
       <w:r>
         <w:rPr>
           <w:rFonts w:ascii="Calibri" w:hAnsi="Calibri"/>
           <w:b w:val="0"/>
-          <w:sz w:val="20"/>
+          <w:i w:val="0"/>
+          <w:sz w:val="19"/>
         </w:rPr>
-        <w:t>APMP Foundations Certified | Vibration Analyst Level 2</w:t>
+        <w:t xml:space="preserve">  |  Vibration Analyst Level 2</w:t>
       </w:r>
     </w:p>
     <w:sectPr>
       <w:pgSz w:w="12240" w:h="15840"/>
-      <w:pgMar w:top="792" w:right="864" w:bottom="792" w:left="864" w:header="720" w:footer="720" w:gutter="0"/>
+      <w:pgMar w:top="720" w:right="936" w:bottom="648" w:left="936" w:header="720" w:footer="720" w:gutter="0"/>
       <w:cols w:space="720"/>
       <w:docGrid w:linePitch="360"/>
     </w:sectPr>
@@ -1354,12 +1447,12 @@
     <w:qFormat/>
     <w:rsid w:val="00FC693F"/>
     <w:pPr>
-      <w:spacing w:after="0" w:before="0" w:line="276" w:lineRule="auto"/>
+      <w:spacing w:after="0" w:before="0" w:line="259" w:lineRule="auto"/>
     </w:pPr>
     <w:rPr>
       <w:rFonts w:ascii="Calibri" w:hAnsi="Calibri"/>
       <w:color w:val="1A1A1A"/>
-      <w:sz w:val="20"/>
+      <w:sz w:val="21"/>
     </w:rPr>
   </w:style>
   <w:style w:type="paragraph" w:styleId="Header">

</xml_diff>

<commit_message>
Fix: remove B&K Vibro from 2005-2012, drop Vibration Analyst cert
</commit_message>
<xml_diff>
--- a/resume.docx
+++ b/resume.docx
@@ -20,7 +20,7 @@
     </w:p>
     <w:p>
       <w:pPr>
-        <w:spacing w:after="120" w:before="0"/>
+        <w:spacing w:after="120"/>
         <w:jc w:val="center"/>
       </w:pPr>
       <w:r>
@@ -781,17 +781,7 @@
           <w:color w:val="1A1A2E"/>
           <w:sz w:val="21"/>
         </w:rPr>
-        <w:t>B&amp;K Vibro, Metrix Instrument Co., Texas A&amp;M — Texas</w:t>
-      </w:r>
-      <w:r>
-        <w:rPr>
-          <w:rFonts w:ascii="Calibri" w:hAnsi="Calibri"/>
-          <w:b w:val="0"/>
-          <w:i w:val="0"/>
-          <w:color w:val="555555"/>
-          <w:sz w:val="19"/>
-        </w:rPr>
-        <w:t xml:space="preserve">  —  </w:t>
+        <w:t>Metrix Instrument Company, Texas A&amp;M University — Texas</w:t>
       </w:r>
     </w:p>
     <w:p>
@@ -806,7 +796,7 @@
           <w:color w:val="1A1A2E"/>
           <w:sz w:val="20"/>
         </w:rPr>
-        <w:t>Sales Engineer / Inside Technical Sales / IT Support / CAD-CAM Programmer</w:t>
+        <w:t>Inside Technical Sales / IT Support / CAD-CAM Programmer</w:t>
       </w:r>
       <w:r>
         <w:rPr>
@@ -817,31 +807,6 @@
           <w:sz w:val="19"/>
         </w:rPr>
         <w:t xml:space="preserve">  |  2005 – 2012</w:t>
-      </w:r>
-    </w:p>
-    <w:p>
-      <w:pPr>
-        <w:spacing w:after="0" w:before="0" w:line="259" w:lineRule="auto"/>
-        <w:ind w:left="288" w:hanging="216"/>
-      </w:pPr>
-      <w:r>
-        <w:rPr>
-          <w:rFonts w:ascii="Calibri" w:hAnsi="Calibri"/>
-          <w:b w:val="0"/>
-          <w:i w:val="0"/>
-          <w:color w:val="1A5C6E"/>
-          <w:sz w:val="20"/>
-        </w:rPr>
-        <w:t xml:space="preserve">•  </w:t>
-      </w:r>
-      <w:r>
-        <w:rPr>
-          <w:rFonts w:ascii="Calibri" w:hAnsi="Calibri"/>
-          <w:b w:val="0"/>
-          <w:i w:val="0"/>
-          <w:sz w:val="20"/>
-        </w:rPr>
-        <w:t>Developed and managed a Texas/Louisiana sales territory for B&amp;K Vibro; delivered vibration analysis and product training to 100+ clients and 20+ employees</w:t>
       </w:r>
     </w:p>
     <w:p>
@@ -891,7 +856,7 @@
           <w:i w:val="0"/>
           <w:sz w:val="20"/>
         </w:rPr>
-        <w:t>Achieved Vibration Analyst Level 2 certification through self-study; trained internal personnel on vibration data analysis and problem-solving</w:t>
+        <w:t>Provided quality customer technical engineering support for over 20 technically advanced measurement devices; delivered product training to 100+ clients and 20+ employees</w:t>
       </w:r>
     </w:p>
     <w:p>
@@ -1062,15 +1027,6 @@
           <w:sz w:val="19"/>
         </w:rPr>
         <w:t>APMP Foundations Certified</w:t>
-      </w:r>
-      <w:r>
-        <w:rPr>
-          <w:rFonts w:ascii="Calibri" w:hAnsi="Calibri"/>
-          <w:b w:val="0"/>
-          <w:i w:val="0"/>
-          <w:sz w:val="19"/>
-        </w:rPr>
-        <w:t xml:space="preserve">  |  Vibration Analyst Level 2</w:t>
       </w:r>
     </w:p>
     <w:sectPr>

</xml_diff>